<commit_message>
Pulir Tarea 3 tras verificación con agentes
Ajustes de redacción y precisión: primera persona en la apertura,
"combinación actual", lectura precisa de A' (A negada), "minitérmino"
en lugar del anglicismo, consistencia del verbo ("nunca se abre") y
puntuación con paréntesis en la conclusión. Contenido matemático sin
cambios (verificado 10/10).

Co-Authored-By: Claude Opus 4.8 <noreply@anthropic.com>
Claude-Session: https://claude.ai/code/session_01V8FTv6GL1GGnkPBui9rwPG
</commit_message>
<xml_diff>
--- a/tarea3-logica-tabla-verdad.docx
+++ b/tarea3-logica-tabla-verdad.docx
@@ -270,7 +270,7 @@
           <w:szCs w:val="22"/>
           <w:rFonts w:ascii="Arial" w:cs="Arial" w:eastAsia="Arial" w:hAnsi="Arial"/>
         </w:rPr>
-        <w:t xml:space="preserve">El propósito de esta tarea es aplicar los elementos de la lógica a una situación real. Una granja necesita una puerta electrónica que se abra solo con una combinación específica de tres botones, identificados como A, B y C. Cada botón es una entrada que toma uno de dos estados: pulsado, que representamos con 1, o en reposo, que representamos con 0. La salida del sistema es X, donde X = 1 indica que la puerta se abre y X = 0 que permanece cerrada.</w:t>
+        <w:t xml:space="preserve">En esta tarea aplicamos los elementos de la lógica a una situación real. Una granja necesita una puerta electrónica que se abra solo con una combinación específica de tres botones, identificados como A, B y C. Cada botón es una entrada que toma uno de dos estados: pulsado, que representamos con 1, o en reposo, que representamos con 0. La salida del sistema es X, donde X = 1 indica que la puerta se abre y X = 0 que permanece cerrada.</w:t>
       </w:r>
     </w:p>
     <w:p>
@@ -334,7 +334,7 @@
           <w:szCs w:val="22"/>
           <w:rFonts w:ascii="Arial" w:cs="Arial" w:eastAsia="Arial" w:hAnsi="Arial"/>
         </w:rPr>
-        <w:t xml:space="preserve">En cualquier otra combinación la puerta permanece cerrada. Se trata de un problema de lógica combinacional: la salida depende solo de la combinación presente de las entradas, sin estados anteriores, y puede describirse con una tabla de verdad y con una función booleana.</w:t>
+        <w:t xml:space="preserve">En cualquier otra combinación la puerta permanece cerrada. Se trata de un problema de lógica combinacional: la salida depende solo de la combinación actual de las entradas, sin depender de estados anteriores, y puede describirse con una tabla de verdad y con una función booleana.</w:t>
       </w:r>
     </w:p>
     <w:p>
@@ -412,7 +412,7 @@
           <w:szCs w:val="22"/>
           <w:rFonts w:ascii="Arial" w:cs="Arial" w:eastAsia="Arial" w:hAnsi="Arial"/>
         </w:rPr>
-        <w:t xml:space="preserve"> y se lee “A en reposo”.</w:t>
+        <w:t xml:space="preserve"> (A negada) y vale 1 cuando A está en reposo.</w:t>
       </w:r>
     </w:p>
     <w:p>
@@ -577,15 +577,15 @@
           <w:szCs w:val="22"/>
           <w:rFonts w:ascii="Arial" w:cs="Arial" w:eastAsia="Arial" w:hAnsi="Arial"/>
         </w:rPr>
-        <w:t xml:space="preserve">minterm</w:t>
-      </w:r>
-      <w:r>
-        <w:rPr>
-          <w:sz w:val="22"/>
-          <w:szCs w:val="22"/>
-          <w:rFonts w:ascii="Arial" w:cs="Arial" w:eastAsia="Arial" w:hAnsi="Arial"/>
-        </w:rPr>
-        <w:t xml:space="preserve">, que es el producto (AND) de las tres entradas, cada una en su forma directa o negada. La función se arma sumando (OR) esos minterms; a esta forma se le llama </w:t>
+        <w:t xml:space="preserve">minitérmino</w:t>
+      </w:r>
+      <w:r>
+        <w:rPr>
+          <w:sz w:val="22"/>
+          <w:szCs w:val="22"/>
+          <w:rFonts w:ascii="Arial" w:cs="Arial" w:eastAsia="Arial" w:hAnsi="Arial"/>
+        </w:rPr>
+        <w:t xml:space="preserve">, que es el producto (AND) de las tres entradas, cada una en su forma directa o negada. La función se forma sumando (OR) esos minitérminos; a esta forma se le llama </w:t>
       </w:r>
       <w:r>
         <w:rPr>
@@ -2025,7 +2025,7 @@
           <w:szCs w:val="22"/>
           <w:rFonts w:ascii="Arial" w:cs="Arial" w:eastAsia="Arial" w:hAnsi="Arial"/>
         </w:rPr>
-        <w:t xml:space="preserve">Las dos filas con X = 1 son (A, B, C) = (0, 0, 1) y (1, 1, 1). Sus minterms son </w:t>
+        <w:t xml:space="preserve">Las dos filas con X = 1 son (A, B, C) = (0, 0, 1) y (1, 1, 1). Sus minitérminos son </w:t>
       </w:r>
       <w:r>
         <w:rPr>
@@ -2325,7 +2325,7 @@
           <w:szCs w:val="22"/>
           <w:rFonts w:ascii="Arial" w:cs="Arial" w:eastAsia="Arial" w:hAnsi="Arial"/>
         </w:rPr>
-        <w:t xml:space="preserve"> se lee así: la puerta se abre cuando A está en reposo y B está en reposo y C está pulsado, o bien cuando A, B y C están pulsados. En su forma simplificada, la puerta se abre siempre que C esté pulsado y, además, A y B se encuentren en el mismo estado.</w:t>
+        <w:t xml:space="preserve"> se lee así: la puerta se abre cuando A y B están en reposo y C está pulsado, o bien cuando A, B y C están pulsados. En su forma simplificada, la puerta se abre siempre que C esté pulsado y, además, A y B se encuentren en el mismo estado.</w:t>
       </w:r>
     </w:p>
     <w:p>
@@ -2487,7 +2487,7 @@
           <w:szCs w:val="22"/>
           <w:rFonts w:ascii="Arial" w:cs="Arial" w:eastAsia="Arial" w:hAnsi="Arial"/>
         </w:rPr>
-        <w:t xml:space="preserve">De las 8 combinaciones posibles, solo 2 abren la puerta, es decir, el 25 %. El botón C es una condición necesaria: si C está en reposo, la puerta nunca abre. Además, A y B deben coincidir entre sí. Este comportamiento se puede construir con compuertas lógicas: dos compuertas AND (una con las entradas negadas A', B' junto con C, y otra con A, B y C) unidas por una compuerta OR; o, de forma más compacta, con una compuerta XNOR entre A y B seguida de una AND con C.</w:t>
+        <w:t xml:space="preserve">De las 8 combinaciones posibles, solo 2 abren la puerta, es decir, el 25 %. El botón C es una condición necesaria: si C está en reposo, la puerta nunca se abre. Además, A y B deben coincidir entre sí. Este comportamiento se puede construir con compuertas lógicas: dos compuertas AND (una con las entradas negadas A', B' junto con C, y otra con A, B y C) unidas por una compuerta OR; o, de forma más compacta, con una compuerta XNOR entre A y B seguida de una AND con C.</w:t>
       </w:r>
     </w:p>
     <w:p>
@@ -2534,7 +2534,7 @@
           <w:szCs w:val="22"/>
           <w:rFonts w:ascii="Arial" w:cs="Arial" w:eastAsia="Arial" w:hAnsi="Arial"/>
         </w:rPr>
-        <w:t xml:space="preserve">La lógica permite traducir una regla de la vida diaria, cuándo debe abrirse una puerta, a un modelo formal y verificable. A partir de las condiciones de apertura se obtuvo la tabla de verdad; de ella, la función </w:t>
+        <w:t xml:space="preserve">La lógica permite traducir una regla de la vida diaria (cuándo debe abrirse una puerta) a un modelo formal y verificable. A partir de las condiciones de apertura se obtuvo la tabla de verdad; de ella, la función </w:t>
       </w:r>
       <w:r>
         <w:rPr>

</xml_diff>

<commit_message>
Actualizar carátula de Tarea 3 (módulo y fecha)
Módulo: "Lógica matemática aplicada"; fecha: 26 de julio de 2026.

Co-Authored-By: Claude Opus 4.8 <noreply@anthropic.com>
Claude-Session: https://claude.ai/code/session_01V8FTv6GL1GGnkPBui9rwPG
</commit_message>
<xml_diff>
--- a/tarea3-logica-tabla-verdad.docx
+++ b/tarea3-logica-tabla-verdad.docx
@@ -162,7 +162,7 @@
           <w:szCs w:val="26"/>
           <w:rFonts w:ascii="Arial" w:cs="Arial" w:eastAsia="Arial" w:hAnsi="Arial"/>
         </w:rPr>
-        <w:t xml:space="preserve">Módulo 3: Lógica matemática</w:t>
+        <w:t xml:space="preserve">Módulo 3: Lógica matemática aplicada</w:t>
       </w:r>
     </w:p>
     <w:p>
@@ -210,7 +210,7 @@
           <w:szCs w:val="24"/>
           <w:rFonts w:ascii="Arial" w:cs="Arial" w:eastAsia="Arial" w:hAnsi="Arial"/>
         </w:rPr>
-        <w:t xml:space="preserve">20 de julio de 2026</w:t>
+        <w:t xml:space="preserve">26 de julio de 2026</w:t>
       </w:r>
     </w:p>
     <w:p>

</xml_diff>